<commit_message>
chore: commit all changes before cleaning repo
</commit_message>
<xml_diff>
--- a/0529高客活动策划v1.docx
+++ b/0529高客活动策划v1.docx
@@ -86,7 +86,7 @@
         <w:rPr>
           <w:rFonts w:hint="eastAsia" w:ascii="方正仿宋_GB2312" w:hAnsi="方正仿宋_GB2312" w:eastAsia="方正仿宋_GB2312" w:cs="方正仿宋_GB2312"/>
         </w:rPr>
-        <w:t xml:space="preserve">活动名称：灵隐问禅 · </w:t>
+        <w:t>活动名称：</w:t>
       </w:r>
       <w:r>
         <w:rPr>
@@ -99,7 +99,15 @@
         <w:rPr>
           <w:rFonts w:hint="eastAsia" w:ascii="方正仿宋_GB2312" w:hAnsi="方正仿宋_GB2312" w:eastAsia="方正仿宋_GB2312" w:cs="方正仿宋_GB2312"/>
         </w:rPr>
-        <w:t>高客服务发布会</w:t>
+        <w:t>高客服</w:t>
+      </w:r>
+      <w:bookmarkStart w:id="0" w:name="_GoBack"/>
+      <w:bookmarkEnd w:id="0"/>
+      <w:r>
+        <w:rPr>
+          <w:rFonts w:hint="eastAsia" w:ascii="方正仿宋_GB2312" w:hAnsi="方正仿宋_GB2312" w:eastAsia="方正仿宋_GB2312" w:cs="方正仿宋_GB2312"/>
+        </w:rPr>
+        <w:t>务发布会</w:t>
       </w:r>
     </w:p>
     <w:p>
@@ -863,8 +871,6 @@
         </w:rPr>
         <w:t>返程</w:t>
       </w:r>
-      <w:bookmarkStart w:id="0" w:name="_GoBack"/>
-      <w:bookmarkEnd w:id="0"/>
     </w:p>
     <w:sectPr>
       <w:pgSz w:w="12240" w:h="15840"/>
@@ -1229,22 +1235,22 @@
     <w:lsdException w:uiPriority="99" w:name="Table Theme"/>
     <w:lsdException w:qFormat="1" w:unhideWhenUsed="0" w:uiPriority="1" w:semiHidden="0" w:name="No Spacing"/>
     <w:lsdException w:qFormat="1" w:unhideWhenUsed="0" w:uiPriority="60" w:semiHidden="0" w:name="Light Shading"/>
-    <w:lsdException w:unhideWhenUsed="0" w:uiPriority="61" w:semiHidden="0" w:name="Light List"/>
+    <w:lsdException w:qFormat="1" w:unhideWhenUsed="0" w:uiPriority="61" w:semiHidden="0" w:name="Light List"/>
     <w:lsdException w:qFormat="1" w:unhideWhenUsed="0" w:uiPriority="62" w:semiHidden="0" w:name="Light Grid"/>
     <w:lsdException w:qFormat="1" w:unhideWhenUsed="0" w:uiPriority="63" w:semiHidden="0" w:name="Medium Shading 1"/>
     <w:lsdException w:qFormat="1" w:unhideWhenUsed="0" w:uiPriority="64" w:semiHidden="0" w:name="Medium Shading 2"/>
     <w:lsdException w:qFormat="1" w:unhideWhenUsed="0" w:uiPriority="65" w:semiHidden="0" w:name="Medium List 1"/>
     <w:lsdException w:qFormat="1" w:unhideWhenUsed="0" w:uiPriority="66" w:semiHidden="0" w:name="Medium List 2"/>
     <w:lsdException w:qFormat="1" w:unhideWhenUsed="0" w:uiPriority="67" w:semiHidden="0" w:name="Medium Grid 1"/>
-    <w:lsdException w:unhideWhenUsed="0" w:uiPriority="68" w:semiHidden="0" w:name="Medium Grid 2"/>
+    <w:lsdException w:qFormat="1" w:unhideWhenUsed="0" w:uiPriority="68" w:semiHidden="0" w:name="Medium Grid 2"/>
     <w:lsdException w:qFormat="1" w:unhideWhenUsed="0" w:uiPriority="69" w:semiHidden="0" w:name="Medium Grid 3"/>
     <w:lsdException w:qFormat="1" w:unhideWhenUsed="0" w:uiPriority="70" w:semiHidden="0" w:name="Dark List"/>
-    <w:lsdException w:unhideWhenUsed="0" w:uiPriority="71" w:semiHidden="0" w:name="Colorful Shading"/>
+    <w:lsdException w:qFormat="1" w:unhideWhenUsed="0" w:uiPriority="71" w:semiHidden="0" w:name="Colorful Shading"/>
     <w:lsdException w:unhideWhenUsed="0" w:uiPriority="72" w:semiHidden="0" w:name="Colorful List"/>
     <w:lsdException w:qFormat="1" w:unhideWhenUsed="0" w:uiPriority="73" w:semiHidden="0" w:name="Colorful Grid"/>
-    <w:lsdException w:unhideWhenUsed="0" w:uiPriority="60" w:semiHidden="0" w:name="Light Shading Accent 1"/>
+    <w:lsdException w:qFormat="1" w:unhideWhenUsed="0" w:uiPriority="60" w:semiHidden="0" w:name="Light Shading Accent 1"/>
     <w:lsdException w:qFormat="1" w:unhideWhenUsed="0" w:uiPriority="61" w:semiHidden="0" w:name="Light List Accent 1"/>
-    <w:lsdException w:unhideWhenUsed="0" w:uiPriority="62" w:semiHidden="0" w:name="Light Grid Accent 1"/>
+    <w:lsdException w:qFormat="1" w:unhideWhenUsed="0" w:uiPriority="62" w:semiHidden="0" w:name="Light Grid Accent 1"/>
     <w:lsdException w:qFormat="1" w:unhideWhenUsed="0" w:uiPriority="63" w:semiHidden="0" w:name="Medium Shading 1 Accent 1"/>
     <w:lsdException w:qFormat="1" w:unhideWhenUsed="0" w:uiPriority="64" w:semiHidden="0" w:name="Medium Shading 2 Accent 1"/>
     <w:lsdException w:qFormat="1" w:unhideWhenUsed="0" w:uiPriority="65" w:semiHidden="0" w:name="Medium List 1 Accent 1"/>
@@ -1252,81 +1258,81 @@
     <w:lsdException w:qFormat="1" w:unhideWhenUsed="0" w:uiPriority="29" w:semiHidden="0" w:name="Quote"/>
     <w:lsdException w:qFormat="1" w:unhideWhenUsed="0" w:uiPriority="30" w:semiHidden="0" w:name="Intense Quote"/>
     <w:lsdException w:qFormat="1" w:unhideWhenUsed="0" w:uiPriority="66" w:semiHidden="0" w:name="Medium List 2 Accent 1"/>
-    <w:lsdException w:unhideWhenUsed="0" w:uiPriority="67" w:semiHidden="0" w:name="Medium Grid 1 Accent 1"/>
-    <w:lsdException w:unhideWhenUsed="0" w:uiPriority="68" w:semiHidden="0" w:name="Medium Grid 2 Accent 1"/>
-    <w:lsdException w:unhideWhenUsed="0" w:uiPriority="69" w:semiHidden="0" w:name="Medium Grid 3 Accent 1"/>
+    <w:lsdException w:qFormat="1" w:unhideWhenUsed="0" w:uiPriority="67" w:semiHidden="0" w:name="Medium Grid 1 Accent 1"/>
+    <w:lsdException w:qFormat="1" w:unhideWhenUsed="0" w:uiPriority="68" w:semiHidden="0" w:name="Medium Grid 2 Accent 1"/>
+    <w:lsdException w:qFormat="1" w:unhideWhenUsed="0" w:uiPriority="69" w:semiHidden="0" w:name="Medium Grid 3 Accent 1"/>
     <w:lsdException w:unhideWhenUsed="0" w:uiPriority="70" w:semiHidden="0" w:name="Dark List Accent 1"/>
     <w:lsdException w:unhideWhenUsed="0" w:uiPriority="71" w:semiHidden="0" w:name="Colorful Shading Accent 1"/>
-    <w:lsdException w:unhideWhenUsed="0" w:uiPriority="72" w:semiHidden="0" w:name="Colorful List Accent 1"/>
+    <w:lsdException w:qFormat="1" w:unhideWhenUsed="0" w:uiPriority="72" w:semiHidden="0" w:name="Colorful List Accent 1"/>
     <w:lsdException w:qFormat="1" w:unhideWhenUsed="0" w:uiPriority="73" w:semiHidden="0" w:name="Colorful Grid Accent 1"/>
-    <w:lsdException w:unhideWhenUsed="0" w:uiPriority="60" w:semiHidden="0" w:name="Light Shading Accent 2"/>
-    <w:lsdException w:unhideWhenUsed="0" w:uiPriority="61" w:semiHidden="0" w:name="Light List Accent 2"/>
+    <w:lsdException w:qFormat="1" w:unhideWhenUsed="0" w:uiPriority="60" w:semiHidden="0" w:name="Light Shading Accent 2"/>
+    <w:lsdException w:qFormat="1" w:unhideWhenUsed="0" w:uiPriority="61" w:semiHidden="0" w:name="Light List Accent 2"/>
     <w:lsdException w:qFormat="1" w:unhideWhenUsed="0" w:uiPriority="62" w:semiHidden="0" w:name="Light Grid Accent 2"/>
     <w:lsdException w:qFormat="1" w:unhideWhenUsed="0" w:uiPriority="63" w:semiHidden="0" w:name="Medium Shading 1 Accent 2"/>
     <w:lsdException w:qFormat="1" w:unhideWhenUsed="0" w:uiPriority="64" w:semiHidden="0" w:name="Medium Shading 2 Accent 2"/>
     <w:lsdException w:qFormat="1" w:unhideWhenUsed="0" w:uiPriority="65" w:semiHidden="0" w:name="Medium List 1 Accent 2"/>
     <w:lsdException w:qFormat="1" w:unhideWhenUsed="0" w:uiPriority="66" w:semiHidden="0" w:name="Medium List 2 Accent 2"/>
-    <w:lsdException w:unhideWhenUsed="0" w:uiPriority="67" w:semiHidden="0" w:name="Medium Grid 1 Accent 2"/>
-    <w:lsdException w:unhideWhenUsed="0" w:uiPriority="68" w:semiHidden="0" w:name="Medium Grid 2 Accent 2"/>
-    <w:lsdException w:unhideWhenUsed="0" w:uiPriority="69" w:semiHidden="0" w:name="Medium Grid 3 Accent 2"/>
+    <w:lsdException w:qFormat="1" w:unhideWhenUsed="0" w:uiPriority="67" w:semiHidden="0" w:name="Medium Grid 1 Accent 2"/>
+    <w:lsdException w:qFormat="1" w:unhideWhenUsed="0" w:uiPriority="68" w:semiHidden="0" w:name="Medium Grid 2 Accent 2"/>
+    <w:lsdException w:qFormat="1" w:unhideWhenUsed="0" w:uiPriority="69" w:semiHidden="0" w:name="Medium Grid 3 Accent 2"/>
     <w:lsdException w:unhideWhenUsed="0" w:uiPriority="70" w:semiHidden="0" w:name="Dark List Accent 2"/>
-    <w:lsdException w:unhideWhenUsed="0" w:uiPriority="71" w:semiHidden="0" w:name="Colorful Shading Accent 2"/>
+    <w:lsdException w:qFormat="1" w:unhideWhenUsed="0" w:uiPriority="71" w:semiHidden="0" w:name="Colorful Shading Accent 2"/>
     <w:lsdException w:unhideWhenUsed="0" w:uiPriority="72" w:semiHidden="0" w:name="Colorful List Accent 2"/>
     <w:lsdException w:qFormat="1" w:unhideWhenUsed="0" w:uiPriority="73" w:semiHidden="0" w:name="Colorful Grid Accent 2"/>
-    <w:lsdException w:unhideWhenUsed="0" w:uiPriority="60" w:semiHidden="0" w:name="Light Shading Accent 3"/>
-    <w:lsdException w:unhideWhenUsed="0" w:uiPriority="61" w:semiHidden="0" w:name="Light List Accent 3"/>
+    <w:lsdException w:qFormat="1" w:unhideWhenUsed="0" w:uiPriority="60" w:semiHidden="0" w:name="Light Shading Accent 3"/>
+    <w:lsdException w:qFormat="1" w:unhideWhenUsed="0" w:uiPriority="61" w:semiHidden="0" w:name="Light List Accent 3"/>
     <w:lsdException w:qFormat="1" w:unhideWhenUsed="0" w:uiPriority="62" w:semiHidden="0" w:name="Light Grid Accent 3"/>
     <w:lsdException w:qFormat="1" w:unhideWhenUsed="0" w:uiPriority="63" w:semiHidden="0" w:name="Medium Shading 1 Accent 3"/>
     <w:lsdException w:qFormat="1" w:unhideWhenUsed="0" w:uiPriority="64" w:semiHidden="0" w:name="Medium Shading 2 Accent 3"/>
     <w:lsdException w:qFormat="1" w:unhideWhenUsed="0" w:uiPriority="65" w:semiHidden="0" w:name="Medium List 1 Accent 3"/>
     <w:lsdException w:qFormat="1" w:unhideWhenUsed="0" w:uiPriority="66" w:semiHidden="0" w:name="Medium List 2 Accent 3"/>
-    <w:lsdException w:unhideWhenUsed="0" w:uiPriority="67" w:semiHidden="0" w:name="Medium Grid 1 Accent 3"/>
-    <w:lsdException w:unhideWhenUsed="0" w:uiPriority="68" w:semiHidden="0" w:name="Medium Grid 2 Accent 3"/>
-    <w:lsdException w:unhideWhenUsed="0" w:uiPriority="69" w:semiHidden="0" w:name="Medium Grid 3 Accent 3"/>
-    <w:lsdException w:unhideWhenUsed="0" w:uiPriority="70" w:semiHidden="0" w:name="Dark List Accent 3"/>
+    <w:lsdException w:qFormat="1" w:unhideWhenUsed="0" w:uiPriority="67" w:semiHidden="0" w:name="Medium Grid 1 Accent 3"/>
+    <w:lsdException w:qFormat="1" w:unhideWhenUsed="0" w:uiPriority="68" w:semiHidden="0" w:name="Medium Grid 2 Accent 3"/>
+    <w:lsdException w:qFormat="1" w:unhideWhenUsed="0" w:uiPriority="69" w:semiHidden="0" w:name="Medium Grid 3 Accent 3"/>
+    <w:lsdException w:qFormat="1" w:unhideWhenUsed="0" w:uiPriority="70" w:semiHidden="0" w:name="Dark List Accent 3"/>
     <w:lsdException w:unhideWhenUsed="0" w:uiPriority="71" w:semiHidden="0" w:name="Colorful Shading Accent 3"/>
-    <w:lsdException w:unhideWhenUsed="0" w:uiPriority="72" w:semiHidden="0" w:name="Colorful List Accent 3"/>
+    <w:lsdException w:qFormat="1" w:unhideWhenUsed="0" w:uiPriority="72" w:semiHidden="0" w:name="Colorful List Accent 3"/>
     <w:lsdException w:qFormat="1" w:unhideWhenUsed="0" w:uiPriority="73" w:semiHidden="0" w:name="Colorful Grid Accent 3"/>
-    <w:lsdException w:unhideWhenUsed="0" w:uiPriority="60" w:semiHidden="0" w:name="Light Shading Accent 4"/>
+    <w:lsdException w:qFormat="1" w:unhideWhenUsed="0" w:uiPriority="60" w:semiHidden="0" w:name="Light Shading Accent 4"/>
     <w:lsdException w:qFormat="1" w:unhideWhenUsed="0" w:uiPriority="61" w:semiHidden="0" w:name="Light List Accent 4"/>
     <w:lsdException w:qFormat="1" w:unhideWhenUsed="0" w:uiPriority="62" w:semiHidden="0" w:name="Light Grid Accent 4"/>
     <w:lsdException w:qFormat="1" w:unhideWhenUsed="0" w:uiPriority="63" w:semiHidden="0" w:name="Medium Shading 1 Accent 4"/>
     <w:lsdException w:qFormat="1" w:unhideWhenUsed="0" w:uiPriority="64" w:semiHidden="0" w:name="Medium Shading 2 Accent 4"/>
     <w:lsdException w:qFormat="1" w:unhideWhenUsed="0" w:uiPriority="65" w:semiHidden="0" w:name="Medium List 1 Accent 4"/>
     <w:lsdException w:qFormat="1" w:unhideWhenUsed="0" w:uiPriority="66" w:semiHidden="0" w:name="Medium List 2 Accent 4"/>
-    <w:lsdException w:unhideWhenUsed="0" w:uiPriority="67" w:semiHidden="0" w:name="Medium Grid 1 Accent 4"/>
-    <w:lsdException w:unhideWhenUsed="0" w:uiPriority="68" w:semiHidden="0" w:name="Medium Grid 2 Accent 4"/>
-    <w:lsdException w:unhideWhenUsed="0" w:uiPriority="69" w:semiHidden="0" w:name="Medium Grid 3 Accent 4"/>
+    <w:lsdException w:qFormat="1" w:unhideWhenUsed="0" w:uiPriority="67" w:semiHidden="0" w:name="Medium Grid 1 Accent 4"/>
+    <w:lsdException w:qFormat="1" w:unhideWhenUsed="0" w:uiPriority="68" w:semiHidden="0" w:name="Medium Grid 2 Accent 4"/>
+    <w:lsdException w:qFormat="1" w:unhideWhenUsed="0" w:uiPriority="69" w:semiHidden="0" w:name="Medium Grid 3 Accent 4"/>
     <w:lsdException w:unhideWhenUsed="0" w:uiPriority="70" w:semiHidden="0" w:name="Dark List Accent 4"/>
-    <w:lsdException w:unhideWhenUsed="0" w:uiPriority="71" w:semiHidden="0" w:name="Colorful Shading Accent 4"/>
+    <w:lsdException w:qFormat="1" w:unhideWhenUsed="0" w:uiPriority="71" w:semiHidden="0" w:name="Colorful Shading Accent 4"/>
     <w:lsdException w:unhideWhenUsed="0" w:uiPriority="72" w:semiHidden="0" w:name="Colorful List Accent 4"/>
     <w:lsdException w:qFormat="1" w:unhideWhenUsed="0" w:uiPriority="73" w:semiHidden="0" w:name="Colorful Grid Accent 4"/>
     <w:lsdException w:qFormat="1" w:unhideWhenUsed="0" w:uiPriority="60" w:semiHidden="0" w:name="Light Shading Accent 5"/>
-    <w:lsdException w:unhideWhenUsed="0" w:uiPriority="61" w:semiHidden="0" w:name="Light List Accent 5"/>
+    <w:lsdException w:qFormat="1" w:unhideWhenUsed="0" w:uiPriority="61" w:semiHidden="0" w:name="Light List Accent 5"/>
     <w:lsdException w:qFormat="1" w:unhideWhenUsed="0" w:uiPriority="62" w:semiHidden="0" w:name="Light Grid Accent 5"/>
     <w:lsdException w:qFormat="1" w:unhideWhenUsed="0" w:uiPriority="63" w:semiHidden="0" w:name="Medium Shading 1 Accent 5"/>
     <w:lsdException w:qFormat="1" w:unhideWhenUsed="0" w:uiPriority="64" w:semiHidden="0" w:name="Medium Shading 2 Accent 5"/>
     <w:lsdException w:qFormat="1" w:unhideWhenUsed="0" w:uiPriority="65" w:semiHidden="0" w:name="Medium List 1 Accent 5"/>
     <w:lsdException w:qFormat="1" w:unhideWhenUsed="0" w:uiPriority="66" w:semiHidden="0" w:name="Medium List 2 Accent 5"/>
-    <w:lsdException w:unhideWhenUsed="0" w:uiPriority="67" w:semiHidden="0" w:name="Medium Grid 1 Accent 5"/>
-    <w:lsdException w:unhideWhenUsed="0" w:uiPriority="68" w:semiHidden="0" w:name="Medium Grid 2 Accent 5"/>
-    <w:lsdException w:unhideWhenUsed="0" w:uiPriority="69" w:semiHidden="0" w:name="Medium Grid 3 Accent 5"/>
-    <w:lsdException w:unhideWhenUsed="0" w:uiPriority="70" w:semiHidden="0" w:name="Dark List Accent 5"/>
+    <w:lsdException w:qFormat="1" w:unhideWhenUsed="0" w:uiPriority="67" w:semiHidden="0" w:name="Medium Grid 1 Accent 5"/>
+    <w:lsdException w:qFormat="1" w:unhideWhenUsed="0" w:uiPriority="68" w:semiHidden="0" w:name="Medium Grid 2 Accent 5"/>
+    <w:lsdException w:qFormat="1" w:unhideWhenUsed="0" w:uiPriority="69" w:semiHidden="0" w:name="Medium Grid 3 Accent 5"/>
+    <w:lsdException w:qFormat="1" w:unhideWhenUsed="0" w:uiPriority="70" w:semiHidden="0" w:name="Dark List Accent 5"/>
     <w:lsdException w:unhideWhenUsed="0" w:uiPriority="71" w:semiHidden="0" w:name="Colorful Shading Accent 5"/>
-    <w:lsdException w:unhideWhenUsed="0" w:uiPriority="72" w:semiHidden="0" w:name="Colorful List Accent 5"/>
+    <w:lsdException w:qFormat="1" w:unhideWhenUsed="0" w:uiPriority="72" w:semiHidden="0" w:name="Colorful List Accent 5"/>
     <w:lsdException w:qFormat="1" w:unhideWhenUsed="0" w:uiPriority="73" w:semiHidden="0" w:name="Colorful Grid Accent 5"/>
-    <w:lsdException w:unhideWhenUsed="0" w:uiPriority="60" w:semiHidden="0" w:name="Light Shading Accent 6"/>
-    <w:lsdException w:unhideWhenUsed="0" w:uiPriority="61" w:semiHidden="0" w:name="Light List Accent 6"/>
+    <w:lsdException w:qFormat="1" w:unhideWhenUsed="0" w:uiPriority="60" w:semiHidden="0" w:name="Light Shading Accent 6"/>
+    <w:lsdException w:qFormat="1" w:unhideWhenUsed="0" w:uiPriority="61" w:semiHidden="0" w:name="Light List Accent 6"/>
     <w:lsdException w:qFormat="1" w:unhideWhenUsed="0" w:uiPriority="62" w:semiHidden="0" w:name="Light Grid Accent 6"/>
     <w:lsdException w:qFormat="1" w:unhideWhenUsed="0" w:uiPriority="63" w:semiHidden="0" w:name="Medium Shading 1 Accent 6"/>
     <w:lsdException w:qFormat="1" w:unhideWhenUsed="0" w:uiPriority="64" w:semiHidden="0" w:name="Medium Shading 2 Accent 6"/>
     <w:lsdException w:qFormat="1" w:unhideWhenUsed="0" w:uiPriority="65" w:semiHidden="0" w:name="Medium List 1 Accent 6"/>
     <w:lsdException w:qFormat="1" w:unhideWhenUsed="0" w:uiPriority="66" w:semiHidden="0" w:name="Medium List 2 Accent 6"/>
-    <w:lsdException w:unhideWhenUsed="0" w:uiPriority="67" w:semiHidden="0" w:name="Medium Grid 1 Accent 6"/>
-    <w:lsdException w:unhideWhenUsed="0" w:uiPriority="68" w:semiHidden="0" w:name="Medium Grid 2 Accent 6"/>
+    <w:lsdException w:qFormat="1" w:unhideWhenUsed="0" w:uiPriority="67" w:semiHidden="0" w:name="Medium Grid 1 Accent 6"/>
+    <w:lsdException w:qFormat="1" w:unhideWhenUsed="0" w:uiPriority="68" w:semiHidden="0" w:name="Medium Grid 2 Accent 6"/>
     <w:lsdException w:qFormat="1" w:unhideWhenUsed="0" w:uiPriority="69" w:semiHidden="0" w:name="Medium Grid 3 Accent 6"/>
     <w:lsdException w:unhideWhenUsed="0" w:uiPriority="70" w:semiHidden="0" w:name="Dark List Accent 6"/>
-    <w:lsdException w:unhideWhenUsed="0" w:uiPriority="71" w:semiHidden="0" w:name="Colorful Shading Accent 6"/>
+    <w:lsdException w:qFormat="1" w:unhideWhenUsed="0" w:uiPriority="71" w:semiHidden="0" w:name="Colorful Shading Accent 6"/>
     <w:lsdException w:unhideWhenUsed="0" w:uiPriority="72" w:semiHidden="0" w:name="Colorful List Accent 6"/>
     <w:lsdException w:qFormat="1" w:unhideWhenUsed="0" w:uiPriority="73" w:semiHidden="0" w:name="Colorful Grid Accent 6"/>
   </w:latentStyles>
@@ -2044,6 +2050,7 @@
   <w:style w:type="table" w:styleId="35">
     <w:name w:val="Light Shading Accent 1"/>
     <w:basedOn w:val="32"/>
+    <w:qFormat/>
     <w:uiPriority w:val="60"/>
     <w:pPr>
       <w:spacing w:after="0" w:line="240" w:lineRule="auto"/>
@@ -2143,6 +2150,7 @@
   <w:style w:type="table" w:styleId="36">
     <w:name w:val="Light Shading Accent 2"/>
     <w:basedOn w:val="32"/>
+    <w:qFormat/>
     <w:uiPriority w:val="60"/>
     <w:pPr>
       <w:spacing w:after="0" w:line="240" w:lineRule="auto"/>
@@ -2242,6 +2250,7 @@
   <w:style w:type="table" w:styleId="37">
     <w:name w:val="Light Shading Accent 3"/>
     <w:basedOn w:val="32"/>
+    <w:qFormat/>
     <w:uiPriority w:val="60"/>
     <w:pPr>
       <w:spacing w:after="0" w:line="240" w:lineRule="auto"/>
@@ -2341,6 +2350,7 @@
   <w:style w:type="table" w:styleId="38">
     <w:name w:val="Light Shading Accent 4"/>
     <w:basedOn w:val="32"/>
+    <w:qFormat/>
     <w:uiPriority w:val="60"/>
     <w:pPr>
       <w:spacing w:after="0" w:line="240" w:lineRule="auto"/>
@@ -2540,6 +2550,7 @@
   <w:style w:type="table" w:styleId="40">
     <w:name w:val="Light Shading Accent 6"/>
     <w:basedOn w:val="32"/>
+    <w:qFormat/>
     <w:uiPriority w:val="60"/>
     <w:pPr>
       <w:spacing w:after="0" w:line="240" w:lineRule="auto"/>
@@ -2639,6 +2650,7 @@
   <w:style w:type="table" w:styleId="41">
     <w:name w:val="Light List"/>
     <w:basedOn w:val="32"/>
+    <w:qFormat/>
     <w:uiPriority w:val="61"/>
     <w:pPr>
       <w:spacing w:after="0" w:line="240" w:lineRule="auto"/>
@@ -2826,6 +2838,7 @@
   <w:style w:type="table" w:styleId="43">
     <w:name w:val="Light List Accent 2"/>
     <w:basedOn w:val="32"/>
+    <w:qFormat/>
     <w:uiPriority w:val="61"/>
     <w:pPr>
       <w:spacing w:after="0" w:line="240" w:lineRule="auto"/>
@@ -2919,6 +2932,7 @@
   <w:style w:type="table" w:styleId="44">
     <w:name w:val="Light List Accent 3"/>
     <w:basedOn w:val="32"/>
+    <w:qFormat/>
     <w:uiPriority w:val="61"/>
     <w:pPr>
       <w:spacing w:after="0" w:line="240" w:lineRule="auto"/>
@@ -3106,6 +3120,7 @@
   <w:style w:type="table" w:styleId="46">
     <w:name w:val="Light List Accent 5"/>
     <w:basedOn w:val="32"/>
+    <w:qFormat/>
     <w:uiPriority w:val="61"/>
     <w:pPr>
       <w:spacing w:after="0" w:line="240" w:lineRule="auto"/>
@@ -3199,6 +3214,7 @@
   <w:style w:type="table" w:styleId="47">
     <w:name w:val="Light List Accent 6"/>
     <w:basedOn w:val="32"/>
+    <w:qFormat/>
     <w:uiPriority w:val="61"/>
     <w:pPr>
       <w:spacing w:after="0" w:line="240" w:lineRule="auto"/>
@@ -3419,6 +3435,7 @@
   <w:style w:type="table" w:styleId="49">
     <w:name w:val="Light Grid Accent 1"/>
     <w:basedOn w:val="32"/>
+    <w:qFormat/>
     <w:uiPriority w:val="62"/>
     <w:pPr>
       <w:spacing w:after="0" w:line="240" w:lineRule="auto"/>
@@ -7715,6 +7732,7 @@
   <w:style w:type="table" w:styleId="84">
     <w:name w:val="Medium Grid 1 Accent 1"/>
     <w:basedOn w:val="32"/>
+    <w:qFormat/>
     <w:uiPriority w:val="67"/>
     <w:pPr>
       <w:spacing w:after="0" w:line="240" w:lineRule="auto"/>
@@ -7784,6 +7802,7 @@
   <w:style w:type="table" w:styleId="85">
     <w:name w:val="Medium Grid 1 Accent 2"/>
     <w:basedOn w:val="32"/>
+    <w:qFormat/>
     <w:uiPriority w:val="67"/>
     <w:pPr>
       <w:spacing w:after="0" w:line="240" w:lineRule="auto"/>
@@ -7853,6 +7872,7 @@
   <w:style w:type="table" w:styleId="86">
     <w:name w:val="Medium Grid 1 Accent 3"/>
     <w:basedOn w:val="32"/>
+    <w:qFormat/>
     <w:uiPriority w:val="67"/>
     <w:pPr>
       <w:spacing w:after="0" w:line="240" w:lineRule="auto"/>
@@ -7922,6 +7942,7 @@
   <w:style w:type="table" w:styleId="87">
     <w:name w:val="Medium Grid 1 Accent 4"/>
     <w:basedOn w:val="32"/>
+    <w:qFormat/>
     <w:uiPriority w:val="67"/>
     <w:pPr>
       <w:spacing w:after="0" w:line="240" w:lineRule="auto"/>
@@ -7991,6 +8012,7 @@
   <w:style w:type="table" w:styleId="88">
     <w:name w:val="Medium Grid 1 Accent 5"/>
     <w:basedOn w:val="32"/>
+    <w:qFormat/>
     <w:uiPriority w:val="67"/>
     <w:pPr>
       <w:spacing w:after="0" w:line="240" w:lineRule="auto"/>
@@ -8060,6 +8082,7 @@
   <w:style w:type="table" w:styleId="89">
     <w:name w:val="Medium Grid 1 Accent 6"/>
     <w:basedOn w:val="32"/>
+    <w:qFormat/>
     <w:uiPriority w:val="67"/>
     <w:pPr>
       <w:spacing w:after="0" w:line="240" w:lineRule="auto"/>
@@ -8129,6 +8152,7 @@
   <w:style w:type="table" w:styleId="90">
     <w:name w:val="Medium Grid 2"/>
     <w:basedOn w:val="32"/>
+    <w:qFormat/>
     <w:uiPriority w:val="68"/>
     <w:pPr>
       <w:spacing w:after="0" w:line="240" w:lineRule="auto"/>
@@ -8275,6 +8299,7 @@
   <w:style w:type="table" w:styleId="91">
     <w:name w:val="Medium Grid 2 Accent 1"/>
     <w:basedOn w:val="32"/>
+    <w:qFormat/>
     <w:uiPriority w:val="68"/>
     <w:pPr>
       <w:spacing w:after="0" w:line="240" w:lineRule="auto"/>
@@ -8421,6 +8446,7 @@
   <w:style w:type="table" w:styleId="92">
     <w:name w:val="Medium Grid 2 Accent 2"/>
     <w:basedOn w:val="32"/>
+    <w:qFormat/>
     <w:uiPriority w:val="68"/>
     <w:pPr>
       <w:spacing w:after="0" w:line="240" w:lineRule="auto"/>
@@ -8567,6 +8593,7 @@
   <w:style w:type="table" w:styleId="93">
     <w:name w:val="Medium Grid 2 Accent 3"/>
     <w:basedOn w:val="32"/>
+    <w:qFormat/>
     <w:uiPriority w:val="68"/>
     <w:pPr>
       <w:spacing w:after="0" w:line="240" w:lineRule="auto"/>
@@ -8713,6 +8740,7 @@
   <w:style w:type="table" w:styleId="94">
     <w:name w:val="Medium Grid 2 Accent 4"/>
     <w:basedOn w:val="32"/>
+    <w:qFormat/>
     <w:uiPriority w:val="68"/>
     <w:pPr>
       <w:spacing w:after="0" w:line="240" w:lineRule="auto"/>
@@ -8859,6 +8887,7 @@
   <w:style w:type="table" w:styleId="95">
     <w:name w:val="Medium Grid 2 Accent 5"/>
     <w:basedOn w:val="32"/>
+    <w:qFormat/>
     <w:uiPriority w:val="68"/>
     <w:pPr>
       <w:spacing w:after="0" w:line="240" w:lineRule="auto"/>
@@ -9005,6 +9034,7 @@
   <w:style w:type="table" w:styleId="96">
     <w:name w:val="Medium Grid 2 Accent 6"/>
     <w:basedOn w:val="32"/>
+    <w:qFormat/>
     <w:uiPriority w:val="68"/>
     <w:pPr>
       <w:spacing w:after="0" w:line="240" w:lineRule="auto"/>
@@ -9309,6 +9339,7 @@
   <w:style w:type="table" w:styleId="98">
     <w:name w:val="Medium Grid 3 Accent 1"/>
     <w:basedOn w:val="32"/>
+    <w:qFormat/>
     <w:uiPriority w:val="69"/>
     <w:pPr>
       <w:spacing w:after="0" w:line="240" w:lineRule="auto"/>
@@ -9466,6 +9497,7 @@
   <w:style w:type="table" w:styleId="99">
     <w:name w:val="Medium Grid 3 Accent 2"/>
     <w:basedOn w:val="32"/>
+    <w:qFormat/>
     <w:uiPriority w:val="69"/>
     <w:pPr>
       <w:spacing w:after="0" w:line="240" w:lineRule="auto"/>
@@ -9623,6 +9655,7 @@
   <w:style w:type="table" w:styleId="100">
     <w:name w:val="Medium Grid 3 Accent 3"/>
     <w:basedOn w:val="32"/>
+    <w:qFormat/>
     <w:uiPriority w:val="69"/>
     <w:pPr>
       <w:spacing w:after="0" w:line="240" w:lineRule="auto"/>
@@ -9780,6 +9813,7 @@
   <w:style w:type="table" w:styleId="101">
     <w:name w:val="Medium Grid 3 Accent 4"/>
     <w:basedOn w:val="32"/>
+    <w:qFormat/>
     <w:uiPriority w:val="69"/>
     <w:pPr>
       <w:spacing w:after="0" w:line="240" w:lineRule="auto"/>
@@ -9937,6 +9971,7 @@
   <w:style w:type="table" w:styleId="102">
     <w:name w:val="Medium Grid 3 Accent 5"/>
     <w:basedOn w:val="32"/>
+    <w:qFormat/>
     <w:uiPriority w:val="69"/>
     <w:pPr>
       <w:spacing w:after="0" w:line="240" w:lineRule="auto"/>
@@ -10598,6 +10633,7 @@
   <w:style w:type="table" w:styleId="107">
     <w:name w:val="Dark List Accent 3"/>
     <w:basedOn w:val="32"/>
+    <w:qFormat/>
     <w:uiPriority w:val="70"/>
     <w:pPr>
       <w:spacing w:after="0" w:line="240" w:lineRule="auto"/>
@@ -10828,6 +10864,7 @@
   <w:style w:type="table" w:styleId="109">
     <w:name w:val="Dark List Accent 5"/>
     <w:basedOn w:val="32"/>
+    <w:qFormat/>
     <w:uiPriority w:val="70"/>
     <w:pPr>
       <w:spacing w:after="0" w:line="240" w:lineRule="auto"/>
@@ -11058,6 +11095,7 @@
   <w:style w:type="table" w:styleId="111">
     <w:name w:val="Colorful Shading"/>
     <w:basedOn w:val="32"/>
+    <w:qFormat/>
     <w:uiPriority w:val="71"/>
     <w:pPr>
       <w:spacing w:after="0" w:line="240" w:lineRule="auto"/>
@@ -11354,6 +11392,7 @@
   <w:style w:type="table" w:styleId="113">
     <w:name w:val="Colorful Shading Accent 2"/>
     <w:basedOn w:val="32"/>
+    <w:qFormat/>
     <w:uiPriority w:val="71"/>
     <w:pPr>
       <w:spacing w:after="0" w:line="240" w:lineRule="auto"/>
@@ -11630,6 +11669,7 @@
   <w:style w:type="table" w:styleId="115">
     <w:name w:val="Colorful Shading Accent 4"/>
     <w:basedOn w:val="32"/>
+    <w:qFormat/>
     <w:uiPriority w:val="71"/>
     <w:pPr>
       <w:spacing w:after="0" w:line="240" w:lineRule="auto"/>
@@ -11926,6 +11966,7 @@
   <w:style w:type="table" w:styleId="117">
     <w:name w:val="Colorful Shading Accent 6"/>
     <w:basedOn w:val="32"/>
+    <w:qFormat/>
     <w:uiPriority w:val="71"/>
     <w:pPr>
       <w:spacing w:after="0" w:line="240" w:lineRule="auto"/>
@@ -12166,6 +12207,7 @@
   <w:style w:type="table" w:styleId="119">
     <w:name w:val="Colorful List Accent 1"/>
     <w:basedOn w:val="32"/>
+    <w:qFormat/>
     <w:uiPriority w:val="72"/>
     <w:pPr>
       <w:spacing w:after="0" w:line="240" w:lineRule="auto"/>
@@ -12350,6 +12392,7 @@
   <w:style w:type="table" w:styleId="121">
     <w:name w:val="Colorful List Accent 3"/>
     <w:basedOn w:val="32"/>
+    <w:qFormat/>
     <w:uiPriority w:val="72"/>
     <w:pPr>
       <w:spacing w:after="0" w:line="240" w:lineRule="auto"/>
@@ -12534,6 +12577,7 @@
   <w:style w:type="table" w:styleId="123">
     <w:name w:val="Colorful List Accent 5"/>
     <w:basedOn w:val="32"/>
+    <w:qFormat/>
     <w:uiPriority w:val="72"/>
     <w:pPr>
       <w:spacing w:after="0" w:line="240" w:lineRule="auto"/>

</xml_diff>